<commit_message>
adding TOC removal calculations to act c
</commit_message>
<xml_diff>
--- a/report.docx
+++ b/report.docx
@@ -1997,87 +1997,7 @@
         </w:numPr>
       </w:pPr>
       <w:r>
-        <w:t xml:space="preserve">Which best describes the pattern in fDOM data over the previous month?</w:t>
-      </w:r>
-    </w:p>
-    <w:p>
-      <w:pPr>
-        <w:pStyle w:val="Compact"/>
-        <w:numPr>
-          <w:ilvl w:val="1"/>
-          <w:numId w:val="1024"/>
-        </w:numPr>
-      </w:pPr>
-      <w:r>
-        <w:t xml:space="preserve">increasing</w:t>
-      </w:r>
-    </w:p>
-    <w:p>
-      <w:pPr>
-        <w:pStyle w:val="Compact"/>
-        <w:numPr>
-          <w:ilvl w:val="1"/>
-          <w:numId w:val="1024"/>
-        </w:numPr>
-      </w:pPr>
-      <w:r>
-        <w:t xml:space="preserve">decreasing</w:t>
-      </w:r>
-    </w:p>
-    <w:p>
-      <w:pPr>
-        <w:pStyle w:val="Compact"/>
-        <w:numPr>
-          <w:ilvl w:val="1"/>
-          <w:numId w:val="1024"/>
-        </w:numPr>
-      </w:pPr>
-      <w:r>
-        <w:t xml:space="preserve">steady (very little change)</w:t>
-      </w:r>
-    </w:p>
-    <w:p>
-      <w:pPr>
-        <w:pStyle w:val="Compact"/>
-        <w:numPr>
-          <w:ilvl w:val="1"/>
-          <w:numId w:val="1024"/>
-        </w:numPr>
-      </w:pPr>
-      <w:r>
-        <w:t xml:space="preserve">highly variable, but neither increasing nor decreasing overall</w:t>
-      </w:r>
-    </w:p>
-    <w:p>
-      <w:pPr>
-        <w:numPr>
-          <w:ilvl w:val="0"/>
-          <w:numId w:val="1023"/>
-        </w:numPr>
-      </w:pPr>
-      <w:r>
-        <w:t xml:space="preserve">Do you decide to increase the coagulation time to reduce the risk of high TOC and potential DBP formation in the filtered water? There is no right or wrong answer to this question. Type</w:t>
-      </w:r>
-      <w:r>
-        <w:t xml:space="preserve"> </w:t>
-      </w:r>
-      <w:r>
-        <w:t xml:space="preserve">‘yes’</w:t>
-      </w:r>
-      <w:r>
-        <w:t xml:space="preserve"> </w:t>
-      </w:r>
-      <w:r>
-        <w:t xml:space="preserve">or</w:t>
-      </w:r>
-      <w:r>
-        <w:t xml:space="preserve"> </w:t>
-      </w:r>
-      <w:r>
-        <w:t xml:space="preserve">‘no’</w:t>
-      </w:r>
-      <w:r>
-        <w:t xml:space="preserve">.</w:t>
+        <w:t xml:space="preserve">Use your answer to Q28 and the required removal of TOC table to calculate how much TOC should be removed from the reservoir on February 20. Round your answer to the nearest tenth (e.g., 3.1).</w:t>
       </w:r>
     </w:p>
     <w:p>
@@ -2097,41 +2017,93 @@
     </w:p>
     <w:p>
       <w:pPr>
-        <w:pStyle w:val="FirstParagraph"/>
-      </w:pPr>
-      <w:r>
-        <w:t xml:space="preserve">Optional exercise: Reflect on why you made this decision. What information did you use to arrive at your final choice?</w:t>
-      </w:r>
-    </w:p>
-    <w:p>
-      <w:pPr>
-        <w:pStyle w:val="BodyText"/>
-      </w:pPr>
-    </w:p>
-    <w:bookmarkEnd w:id="44"/>
-    <w:bookmarkStart w:id="45" w:name="management-decision-2-spring-data"/>
-    <w:p>
-      <w:pPr>
-        <w:pStyle w:val="Heading4"/>
-      </w:pPr>
-      <w:r>
-        <w:t xml:space="preserve">Management decision #2: Spring data</w:t>
-      </w:r>
-    </w:p>
-    <w:p>
-      <w:pPr>
-        <w:pStyle w:val="FirstParagraph"/>
-      </w:pPr>
-    </w:p>
-    <w:p>
-      <w:pPr>
-        <w:numPr>
-          <w:ilvl w:val="0"/>
-          <w:numId w:val="1025"/>
-        </w:numPr>
-      </w:pPr>
-      <w:r>
-        <w:t xml:space="preserve">For April 15, what is the corresponding TOC in mg/L of the fDOM observation for today? Use the fDOM to TOC converter to help answer the question. Round your answer to the nearest tenth (e.g., 3.1).</w:t>
+        <w:numPr>
+          <w:ilvl w:val="0"/>
+          <w:numId w:val="1023"/>
+        </w:numPr>
+      </w:pPr>
+      <w:r>
+        <w:t xml:space="preserve">Which best describes the pattern in fDOM data over the previous month?</w:t>
+      </w:r>
+    </w:p>
+    <w:p>
+      <w:pPr>
+        <w:pStyle w:val="Compact"/>
+        <w:numPr>
+          <w:ilvl w:val="1"/>
+          <w:numId w:val="1024"/>
+        </w:numPr>
+      </w:pPr>
+      <w:r>
+        <w:t xml:space="preserve">increasing</w:t>
+      </w:r>
+    </w:p>
+    <w:p>
+      <w:pPr>
+        <w:pStyle w:val="Compact"/>
+        <w:numPr>
+          <w:ilvl w:val="1"/>
+          <w:numId w:val="1024"/>
+        </w:numPr>
+      </w:pPr>
+      <w:r>
+        <w:t xml:space="preserve">decreasing</w:t>
+      </w:r>
+    </w:p>
+    <w:p>
+      <w:pPr>
+        <w:pStyle w:val="Compact"/>
+        <w:numPr>
+          <w:ilvl w:val="1"/>
+          <w:numId w:val="1024"/>
+        </w:numPr>
+      </w:pPr>
+      <w:r>
+        <w:t xml:space="preserve">steady (very little change)</w:t>
+      </w:r>
+    </w:p>
+    <w:p>
+      <w:pPr>
+        <w:pStyle w:val="Compact"/>
+        <w:numPr>
+          <w:ilvl w:val="1"/>
+          <w:numId w:val="1024"/>
+        </w:numPr>
+      </w:pPr>
+      <w:r>
+        <w:t xml:space="preserve">highly variable, but neither increasing nor decreasing overall</w:t>
+      </w:r>
+    </w:p>
+    <w:p>
+      <w:pPr>
+        <w:numPr>
+          <w:ilvl w:val="0"/>
+          <w:numId w:val="1023"/>
+        </w:numPr>
+      </w:pPr>
+      <w:r>
+        <w:t xml:space="preserve">Do you decide to increase the coagulation time to reduce the risk of high TOC and potential DBP formation in the filtered water? There is no right or wrong answer to this question. Type</w:t>
+      </w:r>
+      <w:r>
+        <w:t xml:space="preserve"> </w:t>
+      </w:r>
+      <w:r>
+        <w:t xml:space="preserve">‘yes’</w:t>
+      </w:r>
+      <w:r>
+        <w:t xml:space="preserve"> </w:t>
+      </w:r>
+      <w:r>
+        <w:t xml:space="preserve">or</w:t>
+      </w:r>
+      <w:r>
+        <w:t xml:space="preserve"> </w:t>
+      </w:r>
+      <w:r>
+        <w:t xml:space="preserve">‘no’</w:t>
+      </w:r>
+      <w:r>
+        <w:t xml:space="preserve">.</w:t>
       </w:r>
     </w:p>
     <w:p>
@@ -2151,93 +2123,41 @@
     </w:p>
     <w:p>
       <w:pPr>
+        <w:pStyle w:val="FirstParagraph"/>
+      </w:pPr>
+      <w:r>
+        <w:t xml:space="preserve">Optional exercise: Reflect on why you made this decision. What information did you use to arrive at your final choice?</w:t>
+      </w:r>
+    </w:p>
+    <w:p>
+      <w:pPr>
+        <w:pStyle w:val="BodyText"/>
+      </w:pPr>
+    </w:p>
+    <w:bookmarkEnd w:id="44"/>
+    <w:bookmarkStart w:id="45" w:name="management-decision-2-spring-data"/>
+    <w:p>
+      <w:pPr>
+        <w:pStyle w:val="Heading4"/>
+      </w:pPr>
+      <w:r>
+        <w:t xml:space="preserve">Management decision #2: Spring data</w:t>
+      </w:r>
+    </w:p>
+    <w:p>
+      <w:pPr>
+        <w:pStyle w:val="FirstParagraph"/>
+      </w:pPr>
+    </w:p>
+    <w:p>
+      <w:pPr>
         <w:numPr>
           <w:ilvl w:val="0"/>
           <w:numId w:val="1025"/>
         </w:numPr>
       </w:pPr>
       <w:r>
-        <w:t xml:space="preserve">Which best describes the pattern in fDOM data over the previous month?</w:t>
-      </w:r>
-    </w:p>
-    <w:p>
-      <w:pPr>
-        <w:pStyle w:val="Compact"/>
-        <w:numPr>
-          <w:ilvl w:val="1"/>
-          <w:numId w:val="1026"/>
-        </w:numPr>
-      </w:pPr>
-      <w:r>
-        <w:t xml:space="preserve">increasing</w:t>
-      </w:r>
-    </w:p>
-    <w:p>
-      <w:pPr>
-        <w:pStyle w:val="Compact"/>
-        <w:numPr>
-          <w:ilvl w:val="1"/>
-          <w:numId w:val="1026"/>
-        </w:numPr>
-      </w:pPr>
-      <w:r>
-        <w:t xml:space="preserve">decreasing</w:t>
-      </w:r>
-    </w:p>
-    <w:p>
-      <w:pPr>
-        <w:pStyle w:val="Compact"/>
-        <w:numPr>
-          <w:ilvl w:val="1"/>
-          <w:numId w:val="1026"/>
-        </w:numPr>
-      </w:pPr>
-      <w:r>
-        <w:t xml:space="preserve">steady (very little change)</w:t>
-      </w:r>
-    </w:p>
-    <w:p>
-      <w:pPr>
-        <w:pStyle w:val="Compact"/>
-        <w:numPr>
-          <w:ilvl w:val="1"/>
-          <w:numId w:val="1026"/>
-        </w:numPr>
-      </w:pPr>
-      <w:r>
-        <w:t xml:space="preserve">highly variable, but neither increasing nor decreasing overall</w:t>
-      </w:r>
-    </w:p>
-    <w:p>
-      <w:pPr>
-        <w:numPr>
-          <w:ilvl w:val="0"/>
-          <w:numId w:val="1025"/>
-        </w:numPr>
-      </w:pPr>
-      <w:r>
-        <w:t xml:space="preserve">Do you decide to increase the coagulation time to reduce the risk of high TOC and potential DBP formation in the filtered water? There is no right or wrong answer to this question. Type</w:t>
-      </w:r>
-      <w:r>
-        <w:t xml:space="preserve"> </w:t>
-      </w:r>
-      <w:r>
-        <w:t xml:space="preserve">‘yes’</w:t>
-      </w:r>
-      <w:r>
-        <w:t xml:space="preserve"> </w:t>
-      </w:r>
-      <w:r>
-        <w:t xml:space="preserve">or</w:t>
-      </w:r>
-      <w:r>
-        <w:t xml:space="preserve"> </w:t>
-      </w:r>
-      <w:r>
-        <w:t xml:space="preserve">‘no’</w:t>
-      </w:r>
-      <w:r>
-        <w:t xml:space="preserve">.</w:t>
+        <w:t xml:space="preserve">For April 15, what is the corresponding TOC in mg/L of the fDOM observation for today? Use the fDOM to TOC converter to help answer the question. Round your answer to the nearest tenth (e.g., 3.1).</w:t>
       </w:r>
     </w:p>
     <w:p>
@@ -2257,6 +2177,138 @@
     </w:p>
     <w:p>
       <w:pPr>
+        <w:numPr>
+          <w:ilvl w:val="0"/>
+          <w:numId w:val="1025"/>
+        </w:numPr>
+      </w:pPr>
+      <w:r>
+        <w:t xml:space="preserve">Use your answer to Q32 and the required removal of TOC table to calculate how much TOC should be removed from the reservoir on April 15. Round your answer to the nearest tenth (e.g., 3.1).</w:t>
+      </w:r>
+    </w:p>
+    <w:p>
+      <w:pPr>
+        <w:numPr>
+          <w:ilvl w:val="0"/>
+          <w:numId w:val="1000"/>
+        </w:numPr>
+      </w:pPr>
+      <w:r>
+        <w:rPr>
+          <w:b/>
+          <w:bCs/>
+        </w:rPr>
+        <w:t xml:space="preserve">Answer:</w:t>
+      </w:r>
+    </w:p>
+    <w:p>
+      <w:pPr>
+        <w:numPr>
+          <w:ilvl w:val="0"/>
+          <w:numId w:val="1025"/>
+        </w:numPr>
+      </w:pPr>
+      <w:r>
+        <w:t xml:space="preserve">Which best describes the pattern in fDOM data over the previous month?</w:t>
+      </w:r>
+    </w:p>
+    <w:p>
+      <w:pPr>
+        <w:pStyle w:val="Compact"/>
+        <w:numPr>
+          <w:ilvl w:val="1"/>
+          <w:numId w:val="1026"/>
+        </w:numPr>
+      </w:pPr>
+      <w:r>
+        <w:t xml:space="preserve">increasing</w:t>
+      </w:r>
+    </w:p>
+    <w:p>
+      <w:pPr>
+        <w:pStyle w:val="Compact"/>
+        <w:numPr>
+          <w:ilvl w:val="1"/>
+          <w:numId w:val="1026"/>
+        </w:numPr>
+      </w:pPr>
+      <w:r>
+        <w:t xml:space="preserve">decreasing</w:t>
+      </w:r>
+    </w:p>
+    <w:p>
+      <w:pPr>
+        <w:pStyle w:val="Compact"/>
+        <w:numPr>
+          <w:ilvl w:val="1"/>
+          <w:numId w:val="1026"/>
+        </w:numPr>
+      </w:pPr>
+      <w:r>
+        <w:t xml:space="preserve">steady (very little change)</w:t>
+      </w:r>
+    </w:p>
+    <w:p>
+      <w:pPr>
+        <w:pStyle w:val="Compact"/>
+        <w:numPr>
+          <w:ilvl w:val="1"/>
+          <w:numId w:val="1026"/>
+        </w:numPr>
+      </w:pPr>
+      <w:r>
+        <w:t xml:space="preserve">highly variable, but neither increasing nor decreasing overall</w:t>
+      </w:r>
+    </w:p>
+    <w:p>
+      <w:pPr>
+        <w:numPr>
+          <w:ilvl w:val="0"/>
+          <w:numId w:val="1025"/>
+        </w:numPr>
+      </w:pPr>
+      <w:r>
+        <w:t xml:space="preserve">Do you decide to increase the coagulation time to reduce the risk of high TOC and potential DBP formation in the filtered water? There is no right or wrong answer to this question. Type</w:t>
+      </w:r>
+      <w:r>
+        <w:t xml:space="preserve"> </w:t>
+      </w:r>
+      <w:r>
+        <w:t xml:space="preserve">‘yes’</w:t>
+      </w:r>
+      <w:r>
+        <w:t xml:space="preserve"> </w:t>
+      </w:r>
+      <w:r>
+        <w:t xml:space="preserve">or</w:t>
+      </w:r>
+      <w:r>
+        <w:t xml:space="preserve"> </w:t>
+      </w:r>
+      <w:r>
+        <w:t xml:space="preserve">‘no’</w:t>
+      </w:r>
+      <w:r>
+        <w:t xml:space="preserve">.</w:t>
+      </w:r>
+    </w:p>
+    <w:p>
+      <w:pPr>
+        <w:numPr>
+          <w:ilvl w:val="0"/>
+          <w:numId w:val="1000"/>
+        </w:numPr>
+      </w:pPr>
+      <w:r>
+        <w:rPr>
+          <w:b/>
+          <w:bCs/>
+        </w:rPr>
+        <w:t xml:space="preserve">Answer:</w:t>
+      </w:r>
+    </w:p>
+    <w:p>
+      <w:pPr>
         <w:pStyle w:val="FirstParagraph"/>
       </w:pPr>
       <w:r>
@@ -2292,6 +2344,32 @@
       </w:pPr>
       <w:r>
         <w:t xml:space="preserve">For August 20, what is the corresponding TOC in mg/L of the fDOM observation for today? Use the fDOM to TOC converter to help answer the question. Round your answer to the nearest tenth (e.g., 3.1).</w:t>
+      </w:r>
+    </w:p>
+    <w:p>
+      <w:pPr>
+        <w:numPr>
+          <w:ilvl w:val="0"/>
+          <w:numId w:val="1000"/>
+        </w:numPr>
+      </w:pPr>
+      <w:r>
+        <w:rPr>
+          <w:b/>
+          <w:bCs/>
+        </w:rPr>
+        <w:t xml:space="preserve">Answer:</w:t>
+      </w:r>
+    </w:p>
+    <w:p>
+      <w:pPr>
+        <w:numPr>
+          <w:ilvl w:val="0"/>
+          <w:numId w:val="1027"/>
+        </w:numPr>
+      </w:pPr>
+      <w:r>
+        <w:t xml:space="preserve">Use your answer to Q36 and the required removal of TOC table to calculate how much TOC should be removed from the reservoir on August 20. Round your answer to the nearest tenth (e.g., 3.1).</w:t>
       </w:r>
     </w:p>
     <w:p>
@@ -2471,7 +2549,7 @@
           <w:i/>
           <w:iCs/>
         </w:rPr>
-        <w:t xml:space="preserve">This app was last updated on: 2026-02-27</w:t>
+        <w:t xml:space="preserve">This app was last updated on: 2026-03-10</w:t>
       </w:r>
     </w:p>
     <w:bookmarkEnd w:id="47"/>
@@ -3694,11 +3772,11 @@
       </w:pPr>
     </w:lvl>
   </w:abstractNum>
-  <w:abstractNum w:abstractNumId="994131">
-    <w:nsid w:val="0A994131"/>
+  <w:abstractNum w:abstractNumId="994132">
+    <w:nsid w:val="0A994132"/>
     <w:multiLevelType w:val="multilevel"/>
     <w:lvl w:ilvl="0">
-      <w:start w:val="31"/>
+      <w:start w:val="32"/>
       <w:numFmt w:val="decimal"/>
       <w:lvlText w:val="%1."/>
       <w:lvlJc w:val="left"/>
@@ -3707,7 +3785,7 @@
       </w:pPr>
     </w:lvl>
     <w:lvl w:ilvl="1">
-      <w:start w:val="31"/>
+      <w:start w:val="32"/>
       <w:numFmt w:val="decimal"/>
       <w:lvlText w:val="%2."/>
       <w:lvlJc w:val="left"/>
@@ -3716,7 +3794,7 @@
       </w:pPr>
     </w:lvl>
     <w:lvl w:ilvl="2">
-      <w:start w:val="31"/>
+      <w:start w:val="32"/>
       <w:numFmt w:val="decimal"/>
       <w:lvlText w:val="%3."/>
       <w:lvlJc w:val="left"/>
@@ -3725,7 +3803,7 @@
       </w:pPr>
     </w:lvl>
     <w:lvl w:ilvl="3">
-      <w:start w:val="31"/>
+      <w:start w:val="32"/>
       <w:numFmt w:val="decimal"/>
       <w:lvlText w:val="%4."/>
       <w:lvlJc w:val="left"/>
@@ -3734,7 +3812,7 @@
       </w:pPr>
     </w:lvl>
     <w:lvl w:ilvl="4">
-      <w:start w:val="31"/>
+      <w:start w:val="32"/>
       <w:numFmt w:val="decimal"/>
       <w:lvlText w:val="%5."/>
       <w:lvlJc w:val="left"/>
@@ -3743,7 +3821,7 @@
       </w:pPr>
     </w:lvl>
     <w:lvl w:ilvl="5">
-      <w:start w:val="31"/>
+      <w:start w:val="32"/>
       <w:numFmt w:val="decimal"/>
       <w:lvlText w:val="%6."/>
       <w:lvlJc w:val="left"/>
@@ -3752,7 +3830,7 @@
       </w:pPr>
     </w:lvl>
     <w:lvl w:ilvl="6">
-      <w:start w:val="31"/>
+      <w:start w:val="32"/>
       <w:numFmt w:val="decimal"/>
       <w:lvlText w:val="%7."/>
       <w:lvlJc w:val="left"/>
@@ -3761,7 +3839,7 @@
       </w:pPr>
     </w:lvl>
     <w:lvl w:ilvl="7">
-      <w:start w:val="31"/>
+      <w:start w:val="32"/>
       <w:numFmt w:val="decimal"/>
       <w:lvlText w:val="%8."/>
       <w:lvlJc w:val="left"/>
@@ -3770,7 +3848,7 @@
       </w:pPr>
     </w:lvl>
     <w:lvl w:ilvl="8">
-      <w:start w:val="31"/>
+      <w:start w:val="32"/>
       <w:numFmt w:val="decimal"/>
       <w:lvlText w:val="%9."/>
       <w:lvlJc w:val="left"/>
@@ -3779,11 +3857,11 @@
       </w:pPr>
     </w:lvl>
   </w:abstractNum>
-  <w:abstractNum w:abstractNumId="994134">
-    <w:nsid w:val="0A994134"/>
+  <w:abstractNum w:abstractNumId="994136">
+    <w:nsid w:val="0A994136"/>
     <w:multiLevelType w:val="multilevel"/>
     <w:lvl w:ilvl="0">
-      <w:start w:val="34"/>
+      <w:start w:val="36"/>
       <w:numFmt w:val="decimal"/>
       <w:lvlText w:val="%1."/>
       <w:lvlJc w:val="left"/>
@@ -3792,7 +3870,7 @@
       </w:pPr>
     </w:lvl>
     <w:lvl w:ilvl="1">
-      <w:start w:val="34"/>
+      <w:start w:val="36"/>
       <w:numFmt w:val="decimal"/>
       <w:lvlText w:val="%2."/>
       <w:lvlJc w:val="left"/>
@@ -3801,7 +3879,7 @@
       </w:pPr>
     </w:lvl>
     <w:lvl w:ilvl="2">
-      <w:start w:val="34"/>
+      <w:start w:val="36"/>
       <w:numFmt w:val="decimal"/>
       <w:lvlText w:val="%3."/>
       <w:lvlJc w:val="left"/>
@@ -3810,7 +3888,7 @@
       </w:pPr>
     </w:lvl>
     <w:lvl w:ilvl="3">
-      <w:start w:val="34"/>
+      <w:start w:val="36"/>
       <w:numFmt w:val="decimal"/>
       <w:lvlText w:val="%4."/>
       <w:lvlJc w:val="left"/>
@@ -3819,7 +3897,7 @@
       </w:pPr>
     </w:lvl>
     <w:lvl w:ilvl="4">
-      <w:start w:val="34"/>
+      <w:start w:val="36"/>
       <w:numFmt w:val="decimal"/>
       <w:lvlText w:val="%5."/>
       <w:lvlJc w:val="left"/>
@@ -3828,7 +3906,7 @@
       </w:pPr>
     </w:lvl>
     <w:lvl w:ilvl="5">
-      <w:start w:val="34"/>
+      <w:start w:val="36"/>
       <w:numFmt w:val="decimal"/>
       <w:lvlText w:val="%6."/>
       <w:lvlJc w:val="left"/>
@@ -3837,7 +3915,7 @@
       </w:pPr>
     </w:lvl>
     <w:lvl w:ilvl="6">
-      <w:start w:val="34"/>
+      <w:start w:val="36"/>
       <w:numFmt w:val="decimal"/>
       <w:lvlText w:val="%7."/>
       <w:lvlJc w:val="left"/>
@@ -3846,7 +3924,7 @@
       </w:pPr>
     </w:lvl>
     <w:lvl w:ilvl="7">
-      <w:start w:val="34"/>
+      <w:start w:val="36"/>
       <w:numFmt w:val="decimal"/>
       <w:lvlText w:val="%8."/>
       <w:lvlJc w:val="left"/>
@@ -3855,7 +3933,7 @@
       </w:pPr>
     </w:lvl>
     <w:lvl w:ilvl="8">
-      <w:start w:val="34"/>
+      <w:start w:val="36"/>
       <w:numFmt w:val="decimal"/>
       <w:lvlText w:val="%9."/>
       <w:lvlJc w:val="left"/>
@@ -4567,33 +4645,33 @@
     </w:lvlOverride>
   </w:num>
   <w:num w:numId="1025">
-    <w:abstractNumId w:val="994131"/>
+    <w:abstractNumId w:val="994132"/>
     <w:lvlOverride w:ilvl="0">
-      <w:startOverride w:val="31"/>
+      <w:startOverride w:val="32"/>
     </w:lvlOverride>
     <w:lvlOverride w:ilvl="1">
-      <w:startOverride w:val="31"/>
+      <w:startOverride w:val="32"/>
     </w:lvlOverride>
     <w:lvlOverride w:ilvl="2">
-      <w:startOverride w:val="31"/>
+      <w:startOverride w:val="32"/>
     </w:lvlOverride>
     <w:lvlOverride w:ilvl="3">
-      <w:startOverride w:val="31"/>
+      <w:startOverride w:val="32"/>
     </w:lvlOverride>
     <w:lvlOverride w:ilvl="4">
-      <w:startOverride w:val="31"/>
+      <w:startOverride w:val="32"/>
     </w:lvlOverride>
     <w:lvlOverride w:ilvl="5">
-      <w:startOverride w:val="31"/>
+      <w:startOverride w:val="32"/>
     </w:lvlOverride>
     <w:lvlOverride w:ilvl="6">
-      <w:startOverride w:val="31"/>
+      <w:startOverride w:val="32"/>
     </w:lvlOverride>
     <w:lvlOverride w:ilvl="7">
-      <w:startOverride w:val="31"/>
+      <w:startOverride w:val="32"/>
     </w:lvlOverride>
     <w:lvlOverride w:ilvl="8">
-      <w:startOverride w:val="31"/>
+      <w:startOverride w:val="32"/>
     </w:lvlOverride>
   </w:num>
   <w:num w:numId="1026">
@@ -4627,33 +4705,33 @@
     </w:lvlOverride>
   </w:num>
   <w:num w:numId="1027">
-    <w:abstractNumId w:val="994134"/>
+    <w:abstractNumId w:val="994136"/>
     <w:lvlOverride w:ilvl="0">
-      <w:startOverride w:val="34"/>
+      <w:startOverride w:val="36"/>
     </w:lvlOverride>
     <w:lvlOverride w:ilvl="1">
-      <w:startOverride w:val="34"/>
+      <w:startOverride w:val="36"/>
     </w:lvlOverride>
     <w:lvlOverride w:ilvl="2">
-      <w:startOverride w:val="34"/>
+      <w:startOverride w:val="36"/>
     </w:lvlOverride>
     <w:lvlOverride w:ilvl="3">
-      <w:startOverride w:val="34"/>
+      <w:startOverride w:val="36"/>
     </w:lvlOverride>
     <w:lvlOverride w:ilvl="4">
-      <w:startOverride w:val="34"/>
+      <w:startOverride w:val="36"/>
     </w:lvlOverride>
     <w:lvlOverride w:ilvl="5">
-      <w:startOverride w:val="34"/>
+      <w:startOverride w:val="36"/>
     </w:lvlOverride>
     <w:lvlOverride w:ilvl="6">
-      <w:startOverride w:val="34"/>
+      <w:startOverride w:val="36"/>
     </w:lvlOverride>
     <w:lvlOverride w:ilvl="7">
-      <w:startOverride w:val="34"/>
+      <w:startOverride w:val="36"/>
     </w:lvlOverride>
     <w:lvlOverride w:ilvl="8">
-      <w:startOverride w:val="34"/>
+      <w:startOverride w:val="36"/>
     </w:lvlOverride>
   </w:num>
   <w:num w:numId="1028">

</xml_diff>

<commit_message>
minor tweaks to wording
</commit_message>
<xml_diff>
--- a/report.docx
+++ b/report.docx
@@ -1997,7 +1997,7 @@
         </w:numPr>
       </w:pPr>
       <w:r>
-        <w:t xml:space="preserve">Use your answer to Q28 and the required removal of TOC table to calculate how much TOC should be removed from the reservoir on February 20. Round your answer to the nearest tenth (e.g., 3.1).</w:t>
+        <w:t xml:space="preserve">Use your answer to Q28 and the required removal of TOC table to calculate how much TOC in mg/L should be removed from the reservoir on February 20. Round your answer to the nearest tenth (e.g., 3.1).</w:t>
       </w:r>
     </w:p>
     <w:p>
@@ -2183,7 +2183,7 @@
         </w:numPr>
       </w:pPr>
       <w:r>
-        <w:t xml:space="preserve">Use your answer to Q32 and the required removal of TOC table to calculate how much TOC should be removed from the reservoir on April 15. Round your answer to the nearest tenth (e.g., 3.1).</w:t>
+        <w:t xml:space="preserve">Use your answer to Q32 and the required removal of TOC table to calculate how much TOC in mg/L should be removed from the reservoir on April 15. Round your answer to the nearest tenth (e.g., 3.1).</w:t>
       </w:r>
     </w:p>
     <w:p>
@@ -2369,7 +2369,7 @@
         </w:numPr>
       </w:pPr>
       <w:r>
-        <w:t xml:space="preserve">Use your answer to Q36 and the required removal of TOC table to calculate how much TOC should be removed from the reservoir on August 20. Round your answer to the nearest tenth (e.g., 3.1).</w:t>
+        <w:t xml:space="preserve">Use your answer to Q36 and the required removal of TOC table to calculate how much TOC in mg/L should be removed from the reservoir on August 20. Round your answer to the nearest tenth (e.g., 3.1).</w:t>
       </w:r>
     </w:p>
     <w:p>

</xml_diff>